<commit_message>
Thuê theo tháng, kiểm tra phạt nguội theo biển số, sửa tương phản giao diện tối
- Giá tháng + km/tháng cho từng xe; bộ tính giá tự chọn cách rẻ hơn (ngày hay
  tháng dương lịch), ngày lẻ = giá tháng ÷ 30; chọn nhanh 1/3/6 tháng, gia hạn
  nhanh; có trong hợp đồng và ảnh/tin nhắn chia sẻ
- Phạt nguội: chọn biển số → kiểm tra (dịch vụ tra cứu công khai), mỗi vi phạm
  tự khớp người giữ xe, ghi hồ sơ một chạm; dịch vụ lỗi thì dán kết quả từ trang
  chính thức (có reCAPTCHA nên không tự tra); tự kiểm tra cả đội theo lịch
- Giao diện tối: ô chọn mất nền (tailwind-merge xóa bg-surface) khiến danh sách
  nền trắng chữ trắng; thêm token popover/hover cho menu, tìm nhanh, danh sách;
  chữ màu trạng thái sáng hơn; toast theo giao diện
- Health check không ghi log theo từng request

Co-Authored-By: Claude Opus 5.5 <noreply@anthropic.com>
</commit_message>
<xml_diff>
--- a/apps/api/assets/templates/hop-dong-thue-xe.docx
+++ b/apps/api/assets/templates/hop-dong-thue-xe.docx
@@ -664,6 +664,25 @@
         <w:jc w:val="both"/>
       </w:pPr>
       <w:r>
+        <w:t xml:space="preserve">– Hình thức thuê: </w:t>
+      </w:r>
+      <w:r>
+        <w:rPr>
+          <w:b/>
+          <w:bCs/>
+        </w:rPr>
+        <w:t xml:space="preserve">{hd.hinh_thuc}</w:t>
+      </w:r>
+      <w:r>
+        <w:t xml:space="preserve">.</w:t>
+      </w:r>
+    </w:p>
+    <w:p>
+      <w:pPr>
+        <w:spacing w:after="80" w:line="300"/>
+        <w:jc w:val="both"/>
+      </w:pPr>
+      <w:r>
         <w:t xml:space="preserve">– Đơn giá: </w:t>
       </w:r>
       <w:r>
@@ -683,6 +702,37 @@
       </w:r>
       <w:r>
         <w:t xml:space="preserve"> đồng/giờ.</w:t>
+      </w:r>
+    </w:p>
+    <w:p>
+      <w:r>
+        <w:t xml:space="preserve">{#co_gia_thang}</w:t>
+      </w:r>
+    </w:p>
+    <w:p>
+      <w:pPr>
+        <w:spacing w:after="80" w:line="300"/>
+        <w:jc w:val="both"/>
+      </w:pPr>
+      <w:r>
+        <w:t xml:space="preserve">– Thuê theo tháng: </w:t>
+      </w:r>
+      <w:r>
+        <w:t xml:space="preserve">{gia.thang}</w:t>
+      </w:r>
+      <w:r>
+        <w:t xml:space="preserve"> đồng/tháng dương lịch, giới hạn </w:t>
+      </w:r>
+      <w:r>
+        <w:t xml:space="preserve">{gia.km_thang}</w:t>
+      </w:r>
+      <w:r>
+        <w:t xml:space="preserve"> km/tháng; ngày lẻ tính bằng giá tháng chia 30.</w:t>
+      </w:r>
+    </w:p>
+    <w:p>
+      <w:r>
+        <w:t xml:space="preserve">{/co_gia_thang}</w:t>
       </w:r>
     </w:p>
     <w:p>

</xml_diff>